<commit_message>
Audit application document lifecycle
Co-authored-by: arena-agent <297053741+arena-agent@users.noreply.github.com>
</commit_message>
<xml_diff>
--- a/documents/live_market_test_2026-09-30/watch_061e136ccf4e01b51b_tsfp_project_supervisor_cover_letter.docx
+++ b/documents/live_market_test_2026-09-30/watch_061e136ccf4e01b51b_tsfp_project_supervisor_cover_letter.docx
@@ -114,7 +114,7 @@
         <w:ind w:left="317" w:hanging="173"/>
       </w:pPr>
       <w:r>
-        <w:t>• Supported administrative operations, procurement processes, financial documentation, and program logistics. (Administrative and Finance Officer | Trend for a Better Tomorrow (TBT) – NGO | Afghanistan (2019-05 – 2019-09))</w:t>
+        <w:t>• Maintained accurate HMIS records and served as Safeguarding Focal Point supporting PSEA and child protection. (TFU Medical Doctor &amp; Safeguarding Focal Point | Action Against Hunger (ACF-International) | Sang-e-Takht TFU, Daikundi (2023-05 – 2025-07))</w:t>
       </w:r>
     </w:p>
     <w:p>
@@ -123,7 +123,7 @@
         <w:ind w:left="317" w:hanging="173"/>
       </w:pPr>
       <w:r>
-        <w:t>• Supported communication and coordination between provincial government departments, NGOs, communities, and development partners. (Public Relations &amp; Communications Advisor | Daikundi Governor's Office | Daikundi, Afghanistan (2020-12 – 2021-08))</w:t>
+        <w:t>• Delivered clinical assessment, diagnosis, treatment, and follow-up care for children with SAM applying WHO, IMAM/CMAM, and national clinical protocols. (TFU Medical Doctor &amp; Safeguarding Focal Point | Action Against Hunger (ACF-International) | Sang-e-Takht TFU, Daikundi (2023-05 – 2025-07))</w:t>
       </w:r>
     </w:p>
     <w:p>

</xml_diff>